<commit_message>
roand 2 xoa data
</commit_message>
<xml_diff>
--- a/CHITIEU/OUTPUT/Dieu_chinh_chi_tieu.docx
+++ b/CHITIEU/OUTPUT/Dieu_chinh_chi_tieu.docx
@@ -253,30 +253,25 @@
     </w:p>
     <w:tbl>
       <w:tblPr>
-        <w:tblW w:w="9415" w:type="dxa"/>
-        <w:tblLook w:val="04A0" w:firstRow="1" w:lastRow="0" w:firstColumn="1" w:lastColumn="0" w:noHBand="0" w:noVBand="1"/>
+        <w:tblStyle w:val="TableGrid"/>
+        <w:tblW w:w="10301" w:type="dxa"/>
+        <w:tblInd w:w="-906" w:type="dxa"/>
+        <w:tblLayout w:type="fixed"/>
+        <w:tblLook w:val="0600" w:firstRow="0" w:lastRow="0" w:firstColumn="0" w:lastColumn="0" w:noHBand="1" w:noVBand="1"/>
       </w:tblPr>
       <w:tblGrid>
-        <w:gridCol w:w="1439"/>
-        <w:gridCol w:w="3902"/>
-        <w:gridCol w:w="2418"/>
-        <w:gridCol w:w="1656"/>
+        <w:gridCol w:w="811"/>
+        <w:gridCol w:w="5130"/>
+        <w:gridCol w:w="2160"/>
+        <w:gridCol w:w="2200"/>
       </w:tblGrid>
       <w:tr>
         <w:trPr>
-          <w:trHeight w:val="979"/>
-          <w:tblHeader/>
+          <w:trHeight w:val="1104"/>
         </w:trPr>
         <w:tc>
           <w:tcPr>
-            <w:tcW w:w="1255" w:type="dxa"/>
-            <w:tcBorders>
-              <w:top w:val="single" w:sz="4" w:space="0" w:color="auto"/>
-              <w:left w:val="single" w:sz="4" w:space="0" w:color="auto"/>
-              <w:bottom w:val="single" w:sz="4" w:space="0" w:color="auto"/>
-              <w:right w:val="single" w:sz="4" w:space="0" w:color="auto"/>
-            </w:tcBorders>
-            <w:vAlign w:val="center"/>
+            <w:tcW w:w="811" w:type="dxa"/>
             <w:hideMark/>
           </w:tcPr>
           <w:p>
@@ -312,14 +307,7 @@
         </w:tc>
         <w:tc>
           <w:tcPr>
-            <w:tcW w:w="4086" w:type="dxa"/>
-            <w:tcBorders>
-              <w:top w:val="single" w:sz="4" w:space="0" w:color="auto"/>
-              <w:left w:val="nil"/>
-              <w:bottom w:val="single" w:sz="4" w:space="0" w:color="auto"/>
-              <w:right w:val="single" w:sz="4" w:space="0" w:color="auto"/>
-            </w:tcBorders>
-            <w:vAlign w:val="center"/>
+            <w:tcW w:w="5130" w:type="dxa"/>
             <w:hideMark/>
           </w:tcPr>
           <w:p>
@@ -347,14 +335,7 @@
         </w:tc>
         <w:tc>
           <w:tcPr>
-            <w:tcW w:w="0" w:type="auto"/>
-            <w:tcBorders>
-              <w:top w:val="single" w:sz="4" w:space="0" w:color="auto"/>
-              <w:left w:val="nil"/>
-              <w:bottom w:val="single" w:sz="4" w:space="0" w:color="auto"/>
-              <w:right w:val="single" w:sz="4" w:space="0" w:color="auto"/>
-            </w:tcBorders>
-            <w:vAlign w:val="center"/>
+            <w:tcW w:w="2160" w:type="dxa"/>
             <w:hideMark/>
           </w:tcPr>
           <w:p>
@@ -381,14 +362,7 @@
         </w:tc>
         <w:tc>
           <w:tcPr>
-            <w:tcW w:w="0" w:type="auto"/>
-            <w:tcBorders>
-              <w:top w:val="single" w:sz="4" w:space="0" w:color="auto"/>
-              <w:left w:val="nil"/>
-              <w:bottom w:val="single" w:sz="4" w:space="0" w:color="auto"/>
-              <w:right w:val="single" w:sz="4" w:space="0" w:color="auto"/>
-            </w:tcBorders>
-            <w:vAlign w:val="center"/>
+            <w:tcW w:w="2200" w:type="dxa"/>
             <w:hideMark/>
           </w:tcPr>
           <w:p>
@@ -427,23 +401,15 @@
       </w:tr>
       <w:tr>
         <w:trPr>
-          <w:trHeight w:val="372"/>
+          <w:trHeight w:val="419"/>
         </w:trPr>
         <w:tc>
           <w:tcPr>
-            <w:tcW w:w="1255" w:type="dxa"/>
-            <w:tcBorders>
-              <w:top w:val="nil"/>
-              <w:left w:val="single" w:sz="4" w:space="0" w:color="auto"/>
-              <w:bottom w:val="single" w:sz="4" w:space="0" w:color="auto"/>
-              <w:right w:val="single" w:sz="4" w:space="0" w:color="auto"/>
-            </w:tcBorders>
-            <w:vAlign w:val="center"/>
+            <w:tcW w:w="811" w:type="dxa"/>
             <w:hideMark/>
           </w:tcPr>
           <w:p>
             <w:pPr>
-              <w:jc w:val="center"/>
               <w:rPr>
                 <w:b/>
                 <w:bCs/>
@@ -466,14 +432,7 @@
         </w:tc>
         <w:tc>
           <w:tcPr>
-            <w:tcW w:w="4086" w:type="dxa"/>
-            <w:tcBorders>
-              <w:top w:val="nil"/>
-              <w:left w:val="nil"/>
-              <w:bottom w:val="single" w:sz="4" w:space="0" w:color="auto"/>
-              <w:right w:val="single" w:sz="4" w:space="0" w:color="auto"/>
-            </w:tcBorders>
-            <w:vAlign w:val="center"/>
+            <w:tcW w:w="5130" w:type="dxa"/>
             <w:hideMark/>
           </w:tcPr>
           <w:p>
@@ -500,14 +459,7 @@
         </w:tc>
         <w:tc>
           <w:tcPr>
-            <w:tcW w:w="0" w:type="auto"/>
-            <w:tcBorders>
-              <w:top w:val="nil"/>
-              <w:left w:val="nil"/>
-              <w:bottom w:val="single" w:sz="4" w:space="0" w:color="auto"/>
-              <w:right w:val="single" w:sz="4" w:space="0" w:color="auto"/>
-            </w:tcBorders>
-            <w:vAlign w:val="center"/>
+            <w:tcW w:w="2160" w:type="dxa"/>
             <w:hideMark/>
           </w:tcPr>
           <w:p>
@@ -534,14 +486,7 @@
         </w:tc>
         <w:tc>
           <w:tcPr>
-            <w:tcW w:w="0" w:type="auto"/>
-            <w:tcBorders>
-              <w:top w:val="nil"/>
-              <w:left w:val="nil"/>
-              <w:bottom w:val="single" w:sz="4" w:space="0" w:color="auto"/>
-              <w:right w:val="single" w:sz="4" w:space="0" w:color="auto"/>
-            </w:tcBorders>
-            <w:vAlign w:val="center"/>
+            <w:tcW w:w="2200" w:type="dxa"/>
             <w:hideMark/>
           </w:tcPr>
           <w:p>
@@ -569,60 +514,41 @@
       </w:tr>
       <w:tr>
         <w:trPr>
-          <w:trHeight w:val="360"/>
+          <w:trHeight w:val="405"/>
         </w:trPr>
         <w:tc>
           <w:tcPr>
-            <w:tcW w:w="1255" w:type="dxa"/>
-            <w:tcBorders>
-              <w:top w:val="nil"/>
-              <w:left w:val="single" w:sz="4" w:space="0" w:color="auto"/>
-              <w:bottom w:val="single" w:sz="4" w:space="0" w:color="auto"/>
-              <w:right w:val="single" w:sz="4" w:space="0" w:color="auto"/>
-            </w:tcBorders>
-            <w:vAlign w:val="center"/>
+            <w:tcW w:w="811" w:type="dxa"/>
             <w:hideMark/>
           </w:tcPr>
           <w:p>
             <w:pPr>
-              <w:jc w:val="center"/>
               <w:rPr>
                 <w:color w:val="081B3A"/>
                 <w:sz w:val="28"/>
                 <w:szCs w:val="28"/>
               </w:rPr>
             </w:pPr>
-            <w:r>
-              <w:rPr>
-                <w:color w:val="081B3A"/>
-                <w:sz w:val="28"/>
-                <w:szCs w:val="28"/>
-              </w:rPr>
-              <w:t> </w:t>
-            </w:r>
-          </w:p>
-        </w:tc>
-        <w:tc>
-          <w:tcPr>
-            <w:tcW w:w="4086" w:type="dxa"/>
-            <w:tcBorders>
-              <w:top w:val="nil"/>
-              <w:left w:val="nil"/>
-              <w:bottom w:val="single" w:sz="4" w:space="0" w:color="auto"/>
-              <w:right w:val="single" w:sz="4" w:space="0" w:color="auto"/>
-            </w:tcBorders>
-            <w:vAlign w:val="center"/>
+          </w:p>
+        </w:tc>
+        <w:tc>
+          <w:tcPr>
+            <w:tcW w:w="5130" w:type="dxa"/>
             <w:hideMark/>
           </w:tcPr>
           <w:p>
             <w:pPr>
               <w:rPr>
-                <w:sz w:val="28"/>
-                <w:szCs w:val="28"/>
-              </w:rPr>
-            </w:pPr>
-            <w:r>
-              <w:rPr>
+                <w:b/>
+                <w:bCs/>
+                <w:sz w:val="28"/>
+                <w:szCs w:val="28"/>
+              </w:rPr>
+            </w:pPr>
+            <w:r>
+              <w:rPr>
+                <w:b/>
+                <w:bCs/>
                 <w:sz w:val="28"/>
                 <w:szCs w:val="28"/>
               </w:rPr>
@@ -632,14 +558,7 @@
         </w:tc>
         <w:tc>
           <w:tcPr>
-            <w:tcW w:w="0" w:type="auto"/>
-            <w:tcBorders>
-              <w:top w:val="nil"/>
-              <w:left w:val="nil"/>
-              <w:bottom w:val="single" w:sz="4" w:space="0" w:color="auto"/>
-              <w:right w:val="single" w:sz="4" w:space="0" w:color="auto"/>
-            </w:tcBorders>
-            <w:vAlign w:val="center"/>
+            <w:tcW w:w="2160" w:type="dxa"/>
             <w:hideMark/>
           </w:tcPr>
           <w:p>
@@ -652,28 +571,11 @@
                 <w:szCs w:val="28"/>
               </w:rPr>
             </w:pPr>
-            <w:r>
-              <w:rPr>
-                <w:b/>
-                <w:bCs/>
-                <w:color w:val="000000"/>
-                <w:sz w:val="28"/>
-                <w:szCs w:val="28"/>
-              </w:rPr>
-              <w:t> </w:t>
-            </w:r>
-          </w:p>
-        </w:tc>
-        <w:tc>
-          <w:tcPr>
-            <w:tcW w:w="0" w:type="auto"/>
-            <w:tcBorders>
-              <w:top w:val="nil"/>
-              <w:left w:val="nil"/>
-              <w:bottom w:val="single" w:sz="4" w:space="0" w:color="auto"/>
-              <w:right w:val="single" w:sz="4" w:space="0" w:color="auto"/>
-            </w:tcBorders>
-            <w:vAlign w:val="center"/>
+          </w:p>
+        </w:tc>
+        <w:tc>
+          <w:tcPr>
+            <w:tcW w:w="2200" w:type="dxa"/>
             <w:hideMark/>
           </w:tcPr>
           <w:p>
@@ -686,33 +588,16 @@
                 <w:szCs w:val="28"/>
               </w:rPr>
             </w:pPr>
-            <w:r>
-              <w:rPr>
-                <w:b/>
-                <w:bCs/>
-                <w:color w:val="000000"/>
-                <w:sz w:val="28"/>
-                <w:szCs w:val="28"/>
-              </w:rPr>
-              <w:t> </w:t>
-            </w:r>
           </w:p>
         </w:tc>
       </w:tr>
       <w:tr>
         <w:trPr>
-          <w:trHeight w:val="720"/>
+          <w:trHeight w:val="647"/>
         </w:trPr>
         <w:tc>
           <w:tcPr>
-            <w:tcW w:w="1255" w:type="dxa"/>
-            <w:tcBorders>
-              <w:top w:val="nil"/>
-              <w:left w:val="single" w:sz="4" w:space="0" w:color="auto"/>
-              <w:bottom w:val="single" w:sz="4" w:space="0" w:color="auto"/>
-              <w:right w:val="single" w:sz="4" w:space="0" w:color="auto"/>
-            </w:tcBorders>
-            <w:vAlign w:val="center"/>
+            <w:tcW w:w="811" w:type="dxa"/>
             <w:hideMark/>
           </w:tcPr>
           <w:p>
@@ -733,14 +618,7 @@
         </w:tc>
         <w:tc>
           <w:tcPr>
-            <w:tcW w:w="4086" w:type="dxa"/>
-            <w:tcBorders>
-              <w:top w:val="nil"/>
-              <w:left w:val="nil"/>
-              <w:bottom w:val="single" w:sz="4" w:space="0" w:color="auto"/>
-              <w:right w:val="single" w:sz="4" w:space="0" w:color="auto"/>
-            </w:tcBorders>
-            <w:vAlign w:val="center"/>
+            <w:tcW w:w="5130" w:type="dxa"/>
             <w:hideMark/>
           </w:tcPr>
           <w:p>
@@ -761,14 +639,7 @@
         </w:tc>
         <w:tc>
           <w:tcPr>
-            <w:tcW w:w="0" w:type="auto"/>
-            <w:tcBorders>
-              <w:top w:val="nil"/>
-              <w:left w:val="nil"/>
-              <w:bottom w:val="single" w:sz="4" w:space="0" w:color="auto"/>
-              <w:right w:val="single" w:sz="4" w:space="0" w:color="auto"/>
-            </w:tcBorders>
-            <w:vAlign w:val="center"/>
+            <w:tcW w:w="2160" w:type="dxa"/>
             <w:hideMark/>
           </w:tcPr>
           <w:p>
@@ -789,14 +660,7 @@
         </w:tc>
         <w:tc>
           <w:tcPr>
-            <w:tcW w:w="0" w:type="auto"/>
-            <w:tcBorders>
-              <w:top w:val="nil"/>
-              <w:left w:val="nil"/>
-              <w:bottom w:val="single" w:sz="4" w:space="0" w:color="auto"/>
-              <w:right w:val="single" w:sz="4" w:space="0" w:color="auto"/>
-            </w:tcBorders>
-            <w:vAlign w:val="center"/>
+            <w:tcW w:w="2200" w:type="dxa"/>
             <w:hideMark/>
           </w:tcPr>
           <w:p>
@@ -818,23 +682,15 @@
       </w:tr>
       <w:tr>
         <w:trPr>
-          <w:trHeight w:val="360"/>
+          <w:trHeight w:val="405"/>
         </w:trPr>
         <w:tc>
           <w:tcPr>
-            <w:tcW w:w="1255" w:type="dxa"/>
-            <w:tcBorders>
-              <w:top w:val="nil"/>
-              <w:left w:val="single" w:sz="4" w:space="0" w:color="auto"/>
-              <w:bottom w:val="single" w:sz="4" w:space="0" w:color="auto"/>
-              <w:right w:val="single" w:sz="4" w:space="0" w:color="auto"/>
-            </w:tcBorders>
-            <w:vAlign w:val="center"/>
+            <w:tcW w:w="811" w:type="dxa"/>
             <w:hideMark/>
           </w:tcPr>
           <w:p>
             <w:pPr>
-              <w:jc w:val="center"/>
               <w:rPr>
                 <w:b/>
                 <w:bCs/>
@@ -845,102 +701,73 @@
             </w:pPr>
             <w:r>
               <w:rPr>
+                <w:b/>
+                <w:bCs/>
                 <w:color w:val="081B3A"/>
                 <w:sz w:val="28"/>
                 <w:szCs w:val="28"/>
               </w:rPr>
+              <w:t>II</w:t>
+            </w:r>
+          </w:p>
+        </w:tc>
+        <w:tc>
+          <w:tcPr>
+            <w:tcW w:w="5130" w:type="dxa"/>
+            <w:hideMark/>
+          </w:tcPr>
+          <w:p>
+            <w:pPr>
+              <w:rPr>
+                <w:b/>
+                <w:bCs/>
+                <w:color w:val="000000"/>
+                <w:sz w:val="28"/>
+                <w:szCs w:val="28"/>
+              </w:rPr>
+            </w:pPr>
+            <w:r>
+              <w:rPr>
+                <w:b/>
+                <w:bCs/>
+                <w:color w:val="000000"/>
+                <w:sz w:val="28"/>
+                <w:szCs w:val="28"/>
+              </w:rPr>
+              <w:t>Kế hoạch dư nợ nguồn vốn UBND thành phố ủy thác</w:t>
+            </w:r>
+          </w:p>
+        </w:tc>
+        <w:tc>
+          <w:tcPr>
+            <w:tcW w:w="2160" w:type="dxa"/>
+            <w:hideMark/>
+          </w:tcPr>
+          <w:p>
+            <w:pPr>
+              <w:rPr>
+                <w:b/>
+                <w:bCs/>
+                <w:color w:val="000000"/>
+                <w:sz w:val="28"/>
+                <w:szCs w:val="28"/>
+              </w:rPr>
+            </w:pPr>
+            <w:r>
+              <w:rPr>
+                <w:b/>
+                <w:bCs/>
+                <w:color w:val="000000"/>
+                <w:sz w:val="28"/>
+                <w:szCs w:val="28"/>
+              </w:rPr>
               <w:t> </w:t>
             </w:r>
-            <w:r>
-              <w:rPr>
-                <w:b/>
-                <w:bCs/>
-                <w:color w:val="081B3A"/>
-                <w:sz w:val="28"/>
-                <w:szCs w:val="28"/>
-              </w:rPr>
-              <w:t>II</w:t>
-            </w:r>
-          </w:p>
-        </w:tc>
-        <w:tc>
-          <w:tcPr>
-            <w:tcW w:w="4086" w:type="dxa"/>
-            <w:tcBorders>
-              <w:top w:val="nil"/>
-              <w:left w:val="nil"/>
-              <w:bottom w:val="single" w:sz="4" w:space="0" w:color="auto"/>
-              <w:right w:val="single" w:sz="4" w:space="0" w:color="auto"/>
-            </w:tcBorders>
-            <w:vAlign w:val="center"/>
-            <w:hideMark/>
-          </w:tcPr>
-          <w:p>
-            <w:pPr>
-              <w:rPr>
-                <w:b/>
-                <w:bCs/>
-                <w:color w:val="000000"/>
-                <w:sz w:val="28"/>
-                <w:szCs w:val="28"/>
-              </w:rPr>
-            </w:pPr>
-            <w:r>
-              <w:rPr>
-                <w:b/>
-                <w:bCs/>
-                <w:color w:val="000000"/>
-                <w:sz w:val="28"/>
-                <w:szCs w:val="28"/>
-              </w:rPr>
-              <w:t>Kế hoạch dư nợ nguồn vốn UBND thành phố ủy thác</w:t>
-            </w:r>
-          </w:p>
-        </w:tc>
-        <w:tc>
-          <w:tcPr>
-            <w:tcW w:w="0" w:type="auto"/>
-            <w:tcBorders>
-              <w:top w:val="nil"/>
-              <w:left w:val="nil"/>
-              <w:bottom w:val="single" w:sz="4" w:space="0" w:color="auto"/>
-              <w:right w:val="single" w:sz="4" w:space="0" w:color="auto"/>
-            </w:tcBorders>
-            <w:vAlign w:val="center"/>
-            <w:hideMark/>
-          </w:tcPr>
-          <w:p>
-            <w:pPr>
-              <w:rPr>
-                <w:b/>
-                <w:bCs/>
-                <w:color w:val="000000"/>
-                <w:sz w:val="28"/>
-                <w:szCs w:val="28"/>
-              </w:rPr>
-            </w:pPr>
-            <w:r>
-              <w:rPr>
-                <w:b/>
-                <w:bCs/>
-                <w:color w:val="000000"/>
-                <w:sz w:val="28"/>
-                <w:szCs w:val="28"/>
-              </w:rPr>
-              <w:t> </w:t>
-            </w:r>
-          </w:p>
-        </w:tc>
-        <w:tc>
-          <w:tcPr>
-            <w:tcW w:w="0" w:type="auto"/>
-            <w:tcBorders>
-              <w:top w:val="nil"/>
-              <w:left w:val="nil"/>
-              <w:bottom w:val="single" w:sz="4" w:space="0" w:color="auto"/>
-              <w:right w:val="single" w:sz="4" w:space="0" w:color="auto"/>
-            </w:tcBorders>
-            <w:vAlign w:val="center"/>
+          </w:p>
+        </w:tc>
+        <w:tc>
+          <w:tcPr>
+            <w:tcW w:w="2200" w:type="dxa"/>
             <w:hideMark/>
           </w:tcPr>
           <w:p>
@@ -968,31 +795,63 @@
       </w:tr>
       <w:tr>
         <w:trPr>
-          <w:trHeight w:val="269"/>
+          <w:trHeight w:val="303"/>
         </w:trPr>
         <w:tc>
           <w:tcPr>
-            <w:tcW w:w="1255" w:type="dxa"/>
-            <w:tcBorders>
-              <w:top w:val="nil"/>
-              <w:left w:val="single" w:sz="4" w:space="0" w:color="auto"/>
-              <w:bottom w:val="single" w:sz="4" w:space="0" w:color="auto"/>
-              <w:right w:val="single" w:sz="4" w:space="0" w:color="auto"/>
-            </w:tcBorders>
-            <w:vAlign w:val="center"/>
-          </w:tcPr>
-          <w:p>
-            <w:pPr>
-              <w:jc w:val="center"/>
+            <w:tcW w:w="811" w:type="dxa"/>
+          </w:tcPr>
+          <w:p>
+            <w:pPr>
               <w:rPr>
                 <w:color w:val="081B3A"/>
                 <w:sz w:val="28"/>
                 <w:szCs w:val="28"/>
               </w:rPr>
             </w:pPr>
-            <w:r>
-              <w:rPr>
-                <w:color w:val="081B3A"/>
+          </w:p>
+        </w:tc>
+        <w:tc>
+          <w:tcPr>
+            <w:tcW w:w="5130" w:type="dxa"/>
+          </w:tcPr>
+          <w:p>
+            <w:pPr>
+              <w:rPr>
+                <w:b/>
+                <w:bCs/>
+                <w:sz w:val="28"/>
+                <w:szCs w:val="28"/>
+              </w:rPr>
+            </w:pPr>
+            <w:r>
+              <w:rPr>
+                <w:b/>
+                <w:bCs/>
+                <w:sz w:val="28"/>
+                <w:szCs w:val="28"/>
+              </w:rPr>
+              <w:t>{{ten_xa_dp}}</w:t>
+            </w:r>
+          </w:p>
+        </w:tc>
+        <w:tc>
+          <w:tcPr>
+            <w:tcW w:w="2160" w:type="dxa"/>
+          </w:tcPr>
+          <w:p>
+            <w:pPr>
+              <w:rPr>
+                <w:color w:val="000000"/>
+                <w:sz w:val="28"/>
+                <w:szCs w:val="28"/>
+              </w:rPr>
+            </w:pPr>
+            <w:r>
+              <w:rPr>
+                <w:b/>
+                <w:bCs/>
+                <w:color w:val="000000"/>
                 <w:sz w:val="28"/>
                 <w:szCs w:val="28"/>
               </w:rPr>
@@ -1002,77 +861,10 @@
         </w:tc>
         <w:tc>
           <w:tcPr>
-            <w:tcW w:w="4086" w:type="dxa"/>
-            <w:tcBorders>
-              <w:top w:val="nil"/>
-              <w:left w:val="nil"/>
-              <w:bottom w:val="single" w:sz="4" w:space="0" w:color="auto"/>
-              <w:right w:val="single" w:sz="4" w:space="0" w:color="auto"/>
-            </w:tcBorders>
-            <w:vAlign w:val="center"/>
-          </w:tcPr>
-          <w:p>
-            <w:pPr>
-              <w:rPr>
-                <w:sz w:val="28"/>
-                <w:szCs w:val="28"/>
-              </w:rPr>
-            </w:pPr>
-            <w:r>
-              <w:rPr>
-                <w:sz w:val="28"/>
-                <w:szCs w:val="28"/>
-              </w:rPr>
-              <w:t>{{ten_xa_dp}}</w:t>
-            </w:r>
-          </w:p>
-        </w:tc>
-        <w:tc>
-          <w:tcPr>
-            <w:tcW w:w="0" w:type="auto"/>
-            <w:tcBorders>
-              <w:top w:val="nil"/>
-              <w:left w:val="nil"/>
-              <w:bottom w:val="single" w:sz="4" w:space="0" w:color="auto"/>
-              <w:right w:val="single" w:sz="4" w:space="0" w:color="auto"/>
-            </w:tcBorders>
-            <w:vAlign w:val="center"/>
-          </w:tcPr>
-          <w:p>
-            <w:pPr>
-              <w:jc w:val="right"/>
-              <w:rPr>
-                <w:color w:val="000000"/>
-                <w:sz w:val="28"/>
-                <w:szCs w:val="28"/>
-              </w:rPr>
-            </w:pPr>
-            <w:r>
-              <w:rPr>
-                <w:b/>
-                <w:bCs/>
-                <w:color w:val="000000"/>
-                <w:sz w:val="28"/>
-                <w:szCs w:val="28"/>
-              </w:rPr>
-              <w:t> </w:t>
-            </w:r>
-          </w:p>
-        </w:tc>
-        <w:tc>
-          <w:tcPr>
-            <w:tcW w:w="0" w:type="auto"/>
-            <w:tcBorders>
-              <w:top w:val="nil"/>
-              <w:left w:val="nil"/>
-              <w:bottom w:val="single" w:sz="4" w:space="0" w:color="auto"/>
-              <w:right w:val="single" w:sz="4" w:space="0" w:color="auto"/>
-            </w:tcBorders>
-            <w:vAlign w:val="center"/>
-          </w:tcPr>
-          <w:p>
-            <w:pPr>
-              <w:jc w:val="right"/>
+            <w:tcW w:w="2200" w:type="dxa"/>
+          </w:tcPr>
+          <w:p>
+            <w:pPr>
               <w:rPr>
                 <w:color w:val="000000"/>
                 <w:sz w:val="28"/>
@@ -1094,18 +886,11 @@
       </w:tr>
       <w:tr>
         <w:trPr>
-          <w:trHeight w:val="360"/>
+          <w:trHeight w:val="405"/>
         </w:trPr>
         <w:tc>
           <w:tcPr>
-            <w:tcW w:w="1255" w:type="dxa"/>
-            <w:tcBorders>
-              <w:top w:val="nil"/>
-              <w:left w:val="single" w:sz="4" w:space="0" w:color="auto"/>
-              <w:bottom w:val="single" w:sz="4" w:space="0" w:color="auto"/>
-              <w:right w:val="single" w:sz="4" w:space="0" w:color="auto"/>
-            </w:tcBorders>
-            <w:vAlign w:val="center"/>
+            <w:tcW w:w="811" w:type="dxa"/>
           </w:tcPr>
           <w:p>
             <w:pPr>
@@ -1125,14 +910,7 @@
         </w:tc>
         <w:tc>
           <w:tcPr>
-            <w:tcW w:w="4086" w:type="dxa"/>
-            <w:tcBorders>
-              <w:top w:val="nil"/>
-              <w:left w:val="nil"/>
-              <w:bottom w:val="single" w:sz="4" w:space="0" w:color="auto"/>
-              <w:right w:val="single" w:sz="4" w:space="0" w:color="auto"/>
-            </w:tcBorders>
-            <w:vAlign w:val="center"/>
+            <w:tcW w:w="5130" w:type="dxa"/>
           </w:tcPr>
           <w:p>
             <w:pPr>
@@ -1152,14 +930,7 @@
         </w:tc>
         <w:tc>
           <w:tcPr>
-            <w:tcW w:w="0" w:type="auto"/>
-            <w:tcBorders>
-              <w:top w:val="nil"/>
-              <w:left w:val="nil"/>
-              <w:bottom w:val="single" w:sz="4" w:space="0" w:color="auto"/>
-              <w:right w:val="single" w:sz="4" w:space="0" w:color="auto"/>
-            </w:tcBorders>
-            <w:vAlign w:val="center"/>
+            <w:tcW w:w="2160" w:type="dxa"/>
           </w:tcPr>
           <w:p>
             <w:pPr>
@@ -1179,14 +950,7 @@
         </w:tc>
         <w:tc>
           <w:tcPr>
-            <w:tcW w:w="0" w:type="auto"/>
-            <w:tcBorders>
-              <w:top w:val="nil"/>
-              <w:left w:val="nil"/>
-              <w:bottom w:val="single" w:sz="4" w:space="0" w:color="auto"/>
-              <w:right w:val="single" w:sz="4" w:space="0" w:color="auto"/>
-            </w:tcBorders>
-            <w:vAlign w:val="center"/>
+            <w:tcW w:w="2200" w:type="dxa"/>
           </w:tcPr>
           <w:p>
             <w:pPr>

</xml_diff>